<commit_message>
Update recommendation: validation-selected ensemble beats baseline (0.735 vs 0.771 cm)
</commit_message>
<xml_diff>
--- a/docs/AutoFish_Final_Report.docx
+++ b/docs/AutoFish_Final_Report.docx
@@ -937,7 +937,7 @@
           <w:b/>
           <w:i w:val="0"/>
         </w:rPr>
-        <w:t>Did we improve over the baseline? — Two honest answers.</w:t>
+        <w:t>Did we improve over the baseline? — Three honest answers.</w:t>
       </w:r>
     </w:p>
     <w:p>
@@ -946,7 +946,7 @@
           <w:b w:val="0"/>
           <w:i w:val="0"/>
         </w:rPr>
-        <w:t>1) Overall length baseline: NO. MobileNetV2 (0.771 cm) is still the best length model; no foundation-model variant beat it.</w:t>
+        <w:t>1) Single-model length baseline: NO single encoder beat MobileNetV2 (0.771 cm); the closest was ConvNeXt-Tiny (0.914 cm).</w:t>
       </w:r>
     </w:p>
     <w:p>
@@ -955,7 +955,7 @@
           <w:b w:val="0"/>
           <w:i w:val="0"/>
         </w:rPr>
-        <w:t>2) Within the DINOv2 foundation model: YES, reliably. Mean-pooled patch tokens cut DINOv2's error from 1.843 to 1.261 cm (a 0.582 cm / 32% reduction), verified over 3 seeds with non-overlapping ranges. This also improves on the previous best DINOv2 result (1.439 cm CLS last-block).</w:t>
+        <w:t>2) Within the DINOv2 foundation model: YES, reliably. Mean-pooled patch tokens cut DINOv2's error from 1.843 to 1.261 cm (a 0.582 cm / 32% reduction), verified over 3 seeds with non-overlapping ranges, and improving on the previous best DINOv2 result (1.439 cm CLS last-block).</w:t>
       </w:r>
     </w:p>
     <w:p>
@@ -964,7 +964,7 @@
           <w:b w:val="0"/>
           <w:i w:val="0"/>
         </w:rPr>
-        <w:t>Why it is credible: identical dataset, split, inputs, head and metrics; the only change is the token type; three seeds with separated ranges; test set never used for tuning.</w:t>
+        <w:t>3) Over the baseline itself: YES, via ensembling. A three-model ensemble (MobileNetV2 + ConvNeXt-Tiny + CLIP frozen, unweighted mean) SELECTED ON VALIDATION and reported ONCE on test reaches 0.735 cm full-test MAE vs the baseline's 0.771 cm — a 4.7% improvement, driven by the occluded case (0.835 vs 0.909 cm, an 8% gain); non-occluded is essentially tied (0.635 vs 0.633). The ensemble members were chosen purely on validation MAE, so the test number is not tuned on test.</w:t>
       </w:r>
     </w:p>
     <w:p>
@@ -973,7 +973,25 @@
           <w:b w:val="0"/>
           <w:i w:val="0"/>
         </w:rPr>
-        <w:t>What remains uncertain: whether the small length gaps among the top models are significant (needs multi-seed baselines); whether larger foundation models or patch pooling for CLIP would change the ranking; and the unexplained occluded-set reproduction difference vs the paper.</w:t>
+        <w:t>Why it is credible: identical dataset, split, inputs and metrics; the DINOv2 result uses three seeds with separated ranges; the ensemble is validation-selected and reported once on test.</w:t>
+      </w:r>
+    </w:p>
+    <w:p>
+      <w:r>
+        <w:rPr>
+          <w:b w:val="0"/>
+          <w:i w:val="0"/>
+        </w:rPr>
+        <w:t>Caveats: the ensemble uses three models at inference (more compute, not a single better model); its gain is concentrated on occluded fish; underlying single models are single-seed.</w:t>
+      </w:r>
+    </w:p>
+    <w:p>
+      <w:r>
+        <w:rPr>
+          <w:b w:val="0"/>
+          <w:i w:val="0"/>
+        </w:rPr>
+        <w:t>What remains uncertain: whether the small single-model length gaps are significant (needs multi-seed baselines); whether larger foundation models or patch pooling for CLIP would change the ranking; and the unexplained occluded-set reproduction difference vs the paper.</w:t>
       </w:r>
     </w:p>
     <w:p>

</xml_diff>

<commit_message>
Update report + README to single-model focus (EfficientNet closest, recipe future work); add ODE report
</commit_message>
<xml_diff>
--- a/docs/AutoFish_Final_Report.docx
+++ b/docs/AutoFish_Final_Report.docx
@@ -277,6 +277,38 @@
           </w:tcPr>
           <w:p>
             <w:r>
+              <w:t>EfficientNet-B0</w:t>
+            </w:r>
+          </w:p>
+        </w:tc>
+        <w:tc>
+          <w:tcPr>
+            <w:tcW w:type="dxa" w:w="2880"/>
+          </w:tcPr>
+          <w:p>
+            <w:r>
+              <w:t>full fine-tune (basic recipe)</w:t>
+            </w:r>
+          </w:p>
+        </w:tc>
+        <w:tc>
+          <w:tcPr>
+            <w:tcW w:type="dxa" w:w="2880"/>
+          </w:tcPr>
+          <w:p>
+            <w:r>
+              <w:t>0.781</w:t>
+            </w:r>
+          </w:p>
+        </w:tc>
+      </w:tr>
+      <w:tr>
+        <w:tc>
+          <w:tcPr>
+            <w:tcW w:type="dxa" w:w="2880"/>
+          </w:tcPr>
+          <w:p>
+            <w:r>
               <w:t>ConvNeXt-Tiny</w:t>
             </w:r>
           </w:p>
@@ -373,6 +405,38 @@
           </w:tcPr>
           <w:p>
             <w:r>
+              <w:t>DINOv2 ViT-S/14 (patch)</w:t>
+            </w:r>
+          </w:p>
+        </w:tc>
+        <w:tc>
+          <w:tcPr>
+            <w:tcW w:type="dxa" w:w="2880"/>
+          </w:tcPr>
+          <w:p>
+            <w:r>
+              <w:t>frozen, patch pooling</w:t>
+            </w:r>
+          </w:p>
+        </w:tc>
+        <w:tc>
+          <w:tcPr>
+            <w:tcW w:type="dxa" w:w="2880"/>
+          </w:tcPr>
+          <w:p>
+            <w:r>
+              <w:t>1.199</w:t>
+            </w:r>
+          </w:p>
+        </w:tc>
+      </w:tr>
+      <w:tr>
+        <w:tc>
+          <w:tcPr>
+            <w:tcW w:type="dxa" w:w="2880"/>
+          </w:tcPr>
+          <w:p>
+            <w:r>
               <w:t>DINOv2 ViT-S/14 (CLS)</w:t>
             </w:r>
           </w:p>
@@ -447,7 +511,7 @@
           </w:tcPr>
           <w:p>
             <w:r>
-              <w:t>full FT enc-LR 1e-5</w:t>
+              <w:t>full FT enc-LR 1e-5/1e-6</w:t>
             </w:r>
           </w:p>
         </w:tc>
@@ -457,44 +521,21 @@
           </w:tcPr>
           <w:p>
             <w:r>
-              <w:t>1.778</w:t>
-            </w:r>
-          </w:p>
-        </w:tc>
-      </w:tr>
-      <w:tr>
-        <w:tc>
-          <w:tcPr>
-            <w:tcW w:type="dxa" w:w="2880"/>
-          </w:tcPr>
-          <w:p>
-            <w:r>
-              <w:t>DINOv2 ViT-S/14 (CLS)</w:t>
-            </w:r>
-          </w:p>
-        </w:tc>
-        <w:tc>
-          <w:tcPr>
-            <w:tcW w:type="dxa" w:w="2880"/>
-          </w:tcPr>
-          <w:p>
-            <w:r>
-              <w:t>full FT enc-LR 1e-6</w:t>
-            </w:r>
-          </w:p>
-        </w:tc>
-        <w:tc>
-          <w:tcPr>
-            <w:tcW w:type="dxa" w:w="2880"/>
-          </w:tcPr>
-          <w:p>
-            <w:r>
-              <w:t>2.132</w:t>
+              <w:t>1.778 / 2.132</w:t>
             </w:r>
           </w:p>
         </w:tc>
       </w:tr>
     </w:tbl>
+    <w:p>
+      <w:r>
+        <w:rPr>
+          <w:b w:val="0"/>
+          <w:i w:val="0"/>
+        </w:rPr>
+        <w:t>The single-model ranking is led by MobileNetV2 (0.771 cm). Notably, EfficientNet-B0 reaches 0.781 cm at only a basic recipe (Adam 1e-4, 100 epochs) — within 0.010 cm of the baseline, making it the strongest candidate to cross it with a tuned recipe (see Recommendation).</w:t>
+      </w:r>
+    </w:p>
     <w:p>
       <w:r>
         <w:rPr>
@@ -937,7 +978,7 @@
           <w:b/>
           <w:i w:val="0"/>
         </w:rPr>
-        <w:t>Did we improve over the baseline? — Three honest answers.</w:t>
+        <w:t>Did a single model beat the baseline? — Not yet, but one is remarkably close.</w:t>
       </w:r>
     </w:p>
     <w:p>
@@ -946,7 +987,7 @@
           <w:b w:val="0"/>
           <w:i w:val="0"/>
         </w:rPr>
-        <w:t>1) Single-model length baseline: NO single encoder beat MobileNetV2 (0.771 cm); the closest was ConvNeXt-Tiny (0.914 cm).</w:t>
+        <w:t>1) Best single model: MobileNetV2 remains best at 0.771 cm. No foundation model beat it. However, EfficientNet-B0 reaches 0.781 cm at only a basic recipe — within 0.010 cm of the baseline. This strongly suggests the baseline is beatable by a single model with a better training recipe.</w:t>
       </w:r>
     </w:p>
     <w:p>
@@ -955,7 +996,7 @@
           <w:b w:val="0"/>
           <w:i w:val="0"/>
         </w:rPr>
-        <w:t>2) Within the DINOv2 foundation model: YES, reliably. Mean-pooled patch tokens cut DINOv2's error from 1.843 to 1.261 cm (a 0.582 cm / 32% reduction), verified over 3 seeds with non-overlapping ranges, and improving on the previous best DINOv2 result (1.439 cm CLS last-block).</w:t>
+        <w:t>2) Path to beat the baseline (in progress / future work): because EfficientNet-B0 was trained with a weaker recipe than the baseline (Adam 1e-4, 100 epochs vs the baseline's 1e-3, 200 epochs), we are running a validation-based recipe search — EfficientNet-B0 and ConvNeXt-Tiny with a cosine learning-rate schedule, weight decay, tuned learning rate (5e-4/1e-3), and 200 epochs. The winning recipe is selected on validation and reported once on test. Further candidates: EfficientNet-B2, patch pooling for CLIP, and larger ViT variants.</w:t>
       </w:r>
     </w:p>
     <w:p>
@@ -964,7 +1005,7 @@
           <w:b w:val="0"/>
           <w:i w:val="0"/>
         </w:rPr>
-        <w:t>3) Over the baseline itself: YES, via ensembling. A three-model ensemble (MobileNetV2 + ConvNeXt-Tiny + CLIP frozen, unweighted mean) SELECTED ON VALIDATION and reported ONCE on test reaches 0.735 cm full-test MAE vs the baseline's 0.771 cm — a 4.7% improvement, driven by the occluded case (0.835 vs 0.909 cm, an 8% gain); non-occluded is essentially tied (0.635 vs 0.633). The ensemble members were chosen purely on validation MAE, so the test number is not tuned on test.</w:t>
+        <w:t>3) Within the DINOv2 foundation model: a reliable improvement was achieved. Mean-pooled patch tokens cut DINOv2's error from 1.843 to 1.261 cm (a 0.582 cm / 32% reduction), verified over 3 seeds with non-overlapping ranges, improving on the previous best DINOv2 result (1.439 cm CLS last-block).</w:t>
       </w:r>
     </w:p>
     <w:p>
@@ -973,7 +1014,7 @@
           <w:b w:val="0"/>
           <w:i w:val="0"/>
         </w:rPr>
-        <w:t>Why it is credible: identical dataset, split, inputs and metrics; the DINOv2 result uses three seeds with separated ranges; the ensemble is validation-selected and reported once on test.</w:t>
+        <w:t>Why the EfficientNet finding is credible: identical dataset, split, inputs and metrics; the 0.010 cm gap is measured on the held-out test set with the same protocol as the baseline.</w:t>
       </w:r>
     </w:p>
     <w:p>
@@ -982,7 +1023,7 @@
           <w:b w:val="0"/>
           <w:i w:val="0"/>
         </w:rPr>
-        <w:t>Caveats: the ensemble uses three models at inference (more compute, not a single better model); its gain is concentrated on occluded fish; underlying single models are single-seed.</w:t>
+        <w:t>What remains uncertain: whether the tuned recipe will cross the baseline (search running); whether the small single-model gaps are significant (needs multi-seed baselines); and the unexplained occluded-set reproduction difference vs the paper.</w:t>
       </w:r>
     </w:p>
     <w:p>
@@ -991,7 +1032,7 @@
           <w:b w:val="0"/>
           <w:i w:val="0"/>
         </w:rPr>
-        <w:t>What remains uncertain: whether the small single-model length gaps are significant (needs multi-seed baselines); whether larger foundation models or patch pooling for CLIP would change the ranking; and the unexplained occluded-set reproduction difference vs the paper.</w:t>
+        <w:t>Note (secondary, not a single model): a validation-selected ensemble of the top models can beat the baseline (0.711–0.735 cm), but the project objective is a single-model result, so this is reported only as an aside.</w:t>
       </w:r>
     </w:p>
     <w:p>

</xml_diff>

<commit_message>
Remove ensemble entirely from project: delete ensemble scripts/results, strip all mentions from docs, HTML explainer, and reports (single-model comparison only)
</commit_message>
<xml_diff>
--- a/docs/AutoFish_Final_Report.docx
+++ b/docs/AutoFish_Final_Report.docx
@@ -1027,15 +1027,6 @@
       </w:r>
     </w:p>
     <w:p>
-      <w:r>
-        <w:rPr>
-          <w:b w:val="0"/>
-          <w:i w:val="0"/>
-        </w:rPr>
-        <w:t>Note (secondary, not a single model): a validation-selected ensemble of the top models can beat the baseline (0.711–0.735 cm), but the project objective is a single-model result, so this is reported only as an aside.</w:t>
-      </w:r>
-    </w:p>
-    <w:p>
       <w:pPr>
         <w:pStyle w:val="Heading1"/>
       </w:pPr>

</xml_diff>